<commit_message>
Escalation chime + finish rename to 'CallPulse Sentinel'
UI: short two-note bell (Web Audio, no asset) plays ONCE per escalation, on LIVE
alerts only — gated so history replay/refresh stays silent, deduped per call_id,
reset on dashboard clear; audio unlocked on first user gesture.

Rename to CallPulse Sentinel: README title, notebook header, and both docx
(Speaker_ID_and_Sentiment_v7, hackathon_submission). 'Customer Rep' label does
not appear in README/docx/cells (cells/docs use lowercase role term 'rep', kept);
the UI/cell 'Customer Rep'->'Representative' rename shipped earlier.
</commit_message>
<xml_diff>
--- a/Speaker_ID_and_Sentiment_v7.docx
+++ b/Speaker_ID_and_Sentiment_v7.docx
@@ -14,7 +14,7 @@
           <w:sz w:val="40"/>
           <w:szCs w:val="40"/>
         </w:rPr>
-        <w:t xml:space="preserve">AI Call Moderator</w:t>
+        <w:t xml:space="preserve">CallPulse Sentinel</w:t>
       </w:r>
     </w:p>
     <w:p>
@@ -54,7 +54,7 @@
         <w:t xml:space="preserve">v7</w:t>
       </w:r>
       <w:r>
-        <w:t xml:space="preserve"> of the AI Call Moderator: (a) how the rep/customer speaker is identified, and (b) a new customer-sentiment traffic-light shown in the dashboard and in the notebook cell output. Both were designed to be </w:t>
+        <w:t xml:space="preserve"> of the CallPulse Sentinel: (a) how the rep/customer speaker is identified, and (b) a new customer-sentiment traffic-light shown in the dashboard and in the notebook cell output. Both were designed to be </w:t>
       </w:r>
       <w:r>
         <w:rPr>

</xml_diff>